<commit_message>
Rebuild every deliverable output with the seed data wording
All FRS, test plans, the register, the migration pack, the alignment pack and the process
deck are rebuilt so no retired wording remains in the Word, Excel and PowerPoint files.
Versions are kept (wording only). Two stale test plan references (BRD-1 message text,
BRD-5 volume 1 frontend test name) follow the current code. Drop indexes regenerated.
</commit_message>
<xml_diff>
--- a/docs/deliverables/out/Drop-0_Setup_and_Data_Migration/Migration/BIBS_Migration_BRD-13_Cutover_Runbook_v1.2.docx
+++ b/docs/deliverables/out/Drop-0_Setup_and_Data_Migration/Migration/BIBS_Migration_BRD-13_Cutover_Runbook_v1.2.docx
@@ -2295,7 +2295,7 @@
       </w:r>
       <w:r>
         <w:rPr/>
-        <w:t>The plan is rehearsed in four mocks (April, July, August and October 2027) and a dress rehearsal (November 2027) (Strategy chapter 10). This version gives planned durations; version 1.3, issued after the dress rehearsal, gives the measured durations and the named people.</w:t>
+        <w:t>The plan is rehearsed in four trial migrations (April, July, August and October 2027) and a dress rehearsal (November 2027) (Strategy chapter 10). This version gives planned durations; version 1.3, issued after the dress rehearsal, gives the measured durations and the named people.</w:t>
       </w:r>
     </w:p>
     <w:p>
@@ -12415,7 +12415,7 @@
               <w:rPr>
                 <w:sz w:val="16"/>
               </w:rPr>
-              <w:t>Legacy clean-up drives - UPP with no reference, invoices open more than 5 years, duplicate clients flagged in Mock 3, unmapped codes</w:t>
+              <w:t>Legacy clean-up drives - UPP with no reference, invoices open more than 5 years, duplicate clients flagged in Trial migration 3, unmapped codes</w:t>
             </w:r>
           </w:p>
         </w:tc>
@@ -12507,7 +12507,7 @@
               <w:rPr>
                 <w:sz w:val="16"/>
               </w:rPr>
-              <w:t>Clean-up tracker; counts reduced against Mock 3 profiling</w:t>
+              <w:t>Clean-up tracker; counts reduced against Trial migration 3 profiling</w:t>
             </w:r>
           </w:p>
         </w:tc>
@@ -12579,7 +12579,7 @@
               <w:rPr>
                 <w:sz w:val="16"/>
               </w:rPr>
-              <w:t>Renewal processing team ready for the January expiries - staffing plan for January (handlers, overtime, back-up) signed; BIBS Renewal training completed; day-1 priority queue worked on the Mock 4 and dress-rehearsal data; draft RA-sent file from the Excel trackers validated and its rejects reviewed (maker-checker)</w:t>
+              <w:t>Renewal processing team ready for the January expiries - staffing plan for January (handlers, overtime, back-up) signed; BIBS Renewal training completed; day-1 priority queue worked on the Trial migration 4 and dress-rehearsal data; draft RA-sent file from the Excel trackers validated and its rejects reviewed (maker-checker)</w:t>
             </w:r>
           </w:p>
         </w:tc>
@@ -14222,7 +14222,7 @@
               <w:rPr>
                 <w:sz w:val="16"/>
               </w:rPr>
-              <w:t>Files CHECKED; counts against the Mock 4 volumes within 5 percent</w:t>
+              <w:t>Files CHECKED; counts against the Trial migration 4 volumes within 5 percent</w:t>
             </w:r>
           </w:p>
         </w:tc>
@@ -28716,7 +28716,7 @@
               <w:rPr>
                 <w:sz w:val="17"/>
               </w:rPr>
-              <w:t>Within 2 business days - root cause, new go-live date, which mocks to repeat; purge the production staging of the failed cutover within 5 days.</w:t>
+              <w:t>Within 2 business days - root cause, new go-live date, which trial migrations to repeat; purge the production staging of the failed cutover within 5 days.</w:t>
             </w:r>
           </w:p>
         </w:tc>

</xml_diff>

<commit_message>
Rebuild all Word, Excel and PowerPoint outputs with the toolkit fixes
Every Word output starts its front matter on page 2 (no blank page after the cover), the
Change Management register is rebuilt with its own builder and listed in the Programme
index, and trial-migration wording is tidied in the alignment pack and the register.
</commit_message>
<xml_diff>
--- a/docs/deliverables/out/Drop-0_Setup_and_Data_Migration/Migration/BIBS_Migration_BRD-13_Cutover_Runbook_v1.2.docx
+++ b/docs/deliverables/out/Drop-0_Setup_and_Data_Migration/Migration/BIBS_Migration_BRD-13_Cutover_Runbook_v1.2.docx
@@ -450,7 +450,7 @@
     </w:tbl>
     <w:p>
       <w:pPr>
-        <w:spacing w:before="3000" w:after="0"/>
+        <w:spacing w:before="2600" w:after="0"/>
       </w:pPr>
     </w:p>
     <w:p>
@@ -518,15 +518,8 @@
     </w:p>
     <w:p>
       <w:pPr>
-        <w:spacing w:after="0"/>
-      </w:pPr>
-      <w:r>
-        <w:br w:type="page"/>
-      </w:r>
-    </w:p>
-    <w:p>
-      <w:pPr>
         <w:pStyle w:val="BDOIFrontHeading"/>
+        <w:pageBreakBefore/>
       </w:pPr>
       <w:r>
         <w:t>Document Control</w:t>

</xml_diff>